<commit_message>
docs: expand system architecture documentation to include hardware and server connection specs
</commit_message>
<xml_diff>
--- a/architecture_documentation.docx
+++ b/architecture_documentation.docx
@@ -1917,6 +1917,697 @@
           <w:color w:val="3873AC"/>
           <w:sz w:val="32"/>
         </w:rPr>
+        <w:t>🌐 Hardware &amp; Server Connection Architecture</w:t>
+      </w:r>
+    </w:p>
+    <w:p>
+      <w:pPr>
+        <w:spacing w:after="120"/>
+      </w:pPr>
+      <w:r>
+        <w:t>The telemetry gateway serves as an electrical-to-cloud bridge, translating physical signal voltages and Modbus industrial protocols into Express-compatible JSON data packages.</w:t>
+      </w:r>
+    </w:p>
+    <w:p>
+      <w:pPr>
+        <w:spacing w:before="160" w:after="40"/>
+      </w:pPr>
+      <w:r>
+        <w:rPr>
+          <w:b/>
+          <w:color w:val="3C3C3C"/>
+          <w:sz w:val="26"/>
+        </w:rPr>
+        <w:t>1. Electrical Signal Digitization &amp; Scaling</w:t>
+      </w:r>
+    </w:p>
+    <w:p>
+      <w:pPr>
+        <w:pStyle w:val="ListBullet"/>
+        <w:spacing w:after="40"/>
+      </w:pPr>
+      <w:r>
+        <w:t xml:space="preserve">  **Analog Input Channels (0-10V or 4-20mA)**:</w:t>
+      </w:r>
+    </w:p>
+    <w:p>
+      <w:pPr>
+        <w:pStyle w:val="ListBullet"/>
+        <w:spacing w:after="40"/>
+      </w:pPr>
+      <w:r>
+        <w:t xml:space="preserve">  The industrial inputs pass through custom opto-isolated front-end filters.</w:t>
+      </w:r>
+    </w:p>
+    <w:p>
+      <w:pPr>
+        <w:pStyle w:val="ListBullet"/>
+        <w:spacing w:after="40"/>
+      </w:pPr>
+      <w:r>
+        <w:t xml:space="preserve">  The signals are digitized by an **ADS1115 16-bit Sigma-Delta ADC** communicating over I2C (`SDA=21, SCL=22`).</w:t>
+      </w:r>
+    </w:p>
+    <w:p>
+      <w:pPr>
+        <w:pStyle w:val="ListBullet"/>
+        <w:spacing w:after="40"/>
+      </w:pPr>
+      <w:r>
+        <w:t xml:space="preserve">  The gateway reads the raw voltage and calculates loop current: $I_{\text{mA}} = V_{\text{raw}} / 0.15$.</w:t>
+      </w:r>
+    </w:p>
+    <w:p>
+      <w:pPr>
+        <w:pStyle w:val="ListBullet"/>
+        <w:spacing w:after="40"/>
+      </w:pPr>
+      <w:r>
+        <w:t xml:space="preserve">  Using linear interpolation, the firmware scales values relative to server-configured ranges:</w:t>
+      </w:r>
+    </w:p>
+    <w:p>
+      <w:pPr>
+        <w:spacing w:after="120"/>
+      </w:pPr>
+      <w:r>
+        <w:t>$$\text{Scaled Value} = \text{Min} + \left(\frac{I_{\text{mA}} - 4.0}{16.0}\right) \times (\text{Max} - \text{Min})$$</w:t>
+      </w:r>
+    </w:p>
+    <w:p>
+      <w:pPr>
+        <w:pStyle w:val="ListBullet"/>
+        <w:spacing w:after="40"/>
+      </w:pPr>
+      <w:r>
+        <w:t xml:space="preserve">  **Opto-Isolated Digital Inputs**:</w:t>
+      </w:r>
+    </w:p>
+    <w:p>
+      <w:pPr>
+        <w:pStyle w:val="ListBullet"/>
+        <w:spacing w:after="40"/>
+      </w:pPr>
+      <w:r>
+        <w:t xml:space="preserve">  Four digital input channels (active-LOW) represent dry contact or level switches.</w:t>
+      </w:r>
+    </w:p>
+    <w:p>
+      <w:pPr>
+        <w:pStyle w:val="ListBullet"/>
+        <w:spacing w:after="40"/>
+      </w:pPr>
+      <w:r>
+        <w:t xml:space="preserve">  Bypassed through internal debounce filters and serialized as boolean values.</w:t>
+      </w:r>
+    </w:p>
+    <w:p>
+      <w:pPr>
+        <w:spacing w:before="160" w:after="40"/>
+      </w:pPr>
+      <w:r>
+        <w:rPr>
+          <w:b/>
+          <w:color w:val="3C3C3C"/>
+          <w:sz w:val="26"/>
+        </w:rPr>
+        <w:t>2. Secure HTTPS Connection Specs</w:t>
+      </w:r>
+    </w:p>
+    <w:p>
+      <w:pPr>
+        <w:pStyle w:val="ListBullet"/>
+        <w:spacing w:after="40"/>
+      </w:pPr>
+      <w:r>
+        <w:t xml:space="preserve">  **Transport Layer**: TLS 1.2 secure client socket connection (`NetworkClientSecure`).</w:t>
+      </w:r>
+    </w:p>
+    <w:p>
+      <w:pPr>
+        <w:pStyle w:val="ListBullet"/>
+        <w:spacing w:after="40"/>
+      </w:pPr>
+      <w:r>
+        <w:t xml:space="preserve">  **Handshake Bypass**: Bypasses root CA certificate verification using `client.setInsecure()`, eliminating the overhead of managing certificates on embedded hardware.</w:t>
+      </w:r>
+    </w:p>
+    <w:p>
+      <w:pPr>
+        <w:pStyle w:val="ListBullet"/>
+        <w:spacing w:after="40"/>
+      </w:pPr>
+      <w:r>
+        <w:t xml:space="preserve">  **Timeout Guard**: Explicitly set to `http.setTimeout(10000)` (10 seconds) to prevent TCP handshakes or poor signals from stalling loop operations.</w:t>
+      </w:r>
+    </w:p>
+    <w:p>
+      <w:pPr>
+        <w:pStyle w:val="ListBullet"/>
+        <w:spacing w:after="40"/>
+      </w:pPr>
+      <w:r>
+        <w:t xml:space="preserve">  **DNS Resolution Diagnostic**: Includes pre-request `WiFi.hostByName()` lookup to output clear router/internet connection errors in local logs.</w:t>
+      </w:r>
+    </w:p>
+    <w:p>
+      <w:pPr>
+        <w:spacing w:before="160" w:after="40"/>
+      </w:pPr>
+      <w:r>
+        <w:rPr>
+          <w:b/>
+          <w:color w:val="3C3C3C"/>
+          <w:sz w:val="26"/>
+        </w:rPr>
+        <w:t>3. API Payload JSON Schema Contracts</w:t>
+      </w:r>
+    </w:p>
+    <w:p>
+      <w:pPr>
+        <w:spacing w:before="120" w:after="40"/>
+      </w:pPr>
+      <w:r>
+        <w:rPr>
+          <w:b/>
+          <w:color w:val="3C3C3C"/>
+          <w:sz w:val="22"/>
+        </w:rPr>
+        <w:t>A. Main Telemetry Endpoint (`POST /api/device-readings`)</w:t>
+      </w:r>
+    </w:p>
+    <w:p>
+      <w:pPr>
+        <w:spacing w:after="120"/>
+      </w:pPr>
+      <w:r>
+        <w:t>Pushes localized ADC and DIN status periodically (default 15 seconds) to the database.</w:t>
+      </w:r>
+    </w:p>
+    <w:p>
+      <w:pPr>
+        <w:spacing w:after="0"/>
+        <w:ind w:left="360"/>
+      </w:pPr>
+      <w:r>
+        <w:rPr>
+          <w:rFonts w:ascii="Courier New" w:hAnsi="Courier New"/>
+          <w:sz w:val="19"/>
+        </w:rPr>
+        <w:t>{</w:t>
+      </w:r>
+    </w:p>
+    <w:p>
+      <w:pPr>
+        <w:spacing w:after="0"/>
+        <w:ind w:left="360"/>
+      </w:pPr>
+      <w:r>
+        <w:rPr>
+          <w:rFonts w:ascii="Courier New" w:hAnsi="Courier New"/>
+          <w:sz w:val="19"/>
+        </w:rPr>
+        <w:t xml:space="preserve">  "device_id": "62fc163f-e804-4676-a221-731232a67a47",</w:t>
+      </w:r>
+    </w:p>
+    <w:p>
+      <w:pPr>
+        <w:spacing w:after="0"/>
+        <w:ind w:left="360"/>
+      </w:pPr>
+      <w:r>
+        <w:rPr>
+          <w:rFonts w:ascii="Courier New" w:hAnsi="Courier New"/>
+          <w:sz w:val="19"/>
+        </w:rPr>
+        <w:t xml:space="preserve">  "analog_ch1": 68.42,</w:t>
+      </w:r>
+    </w:p>
+    <w:p>
+      <w:pPr>
+        <w:spacing w:after="0"/>
+        <w:ind w:left="360"/>
+      </w:pPr>
+      <w:r>
+        <w:rPr>
+          <w:rFonts w:ascii="Courier New" w:hAnsi="Courier New"/>
+          <w:sz w:val="19"/>
+        </w:rPr>
+        <w:t xml:space="preserve">  "analog_ch1_mode": "4-20mA",</w:t>
+      </w:r>
+    </w:p>
+    <w:p>
+      <w:pPr>
+        <w:spacing w:after="0"/>
+        <w:ind w:left="360"/>
+      </w:pPr>
+      <w:r>
+        <w:rPr>
+          <w:rFonts w:ascii="Courier New" w:hAnsi="Courier New"/>
+          <w:sz w:val="19"/>
+        </w:rPr>
+        <w:t xml:space="preserve">  "analog_ch2": 2.15,</w:t>
+      </w:r>
+    </w:p>
+    <w:p>
+      <w:pPr>
+        <w:spacing w:after="0"/>
+        <w:ind w:left="360"/>
+      </w:pPr>
+      <w:r>
+        <w:rPr>
+          <w:rFonts w:ascii="Courier New" w:hAnsi="Courier New"/>
+          <w:sz w:val="19"/>
+        </w:rPr>
+        <w:t xml:space="preserve">  "analog_ch2_mode": "0-10V",</w:t>
+      </w:r>
+    </w:p>
+    <w:p>
+      <w:pPr>
+        <w:spacing w:after="0"/>
+        <w:ind w:left="360"/>
+      </w:pPr>
+      <w:r>
+        <w:rPr>
+          <w:rFonts w:ascii="Courier New" w:hAnsi="Courier New"/>
+          <w:sz w:val="19"/>
+        </w:rPr>
+        <w:t xml:space="preserve">  "analog_ch3": 0.0,</w:t>
+      </w:r>
+    </w:p>
+    <w:p>
+      <w:pPr>
+        <w:spacing w:after="0"/>
+        <w:ind w:left="360"/>
+      </w:pPr>
+      <w:r>
+        <w:rPr>
+          <w:rFonts w:ascii="Courier New" w:hAnsi="Courier New"/>
+          <w:sz w:val="19"/>
+        </w:rPr>
+        <w:t xml:space="preserve">  "analog_ch3_mode": "0-10V",</w:t>
+      </w:r>
+    </w:p>
+    <w:p>
+      <w:pPr>
+        <w:spacing w:after="0"/>
+        <w:ind w:left="360"/>
+      </w:pPr>
+      <w:r>
+        <w:rPr>
+          <w:rFonts w:ascii="Courier New" w:hAnsi="Courier New"/>
+          <w:sz w:val="19"/>
+        </w:rPr>
+        <w:t xml:space="preserve">  "analog_ch4": 0.0,</w:t>
+      </w:r>
+    </w:p>
+    <w:p>
+      <w:pPr>
+        <w:spacing w:after="0"/>
+        <w:ind w:left="360"/>
+      </w:pPr>
+      <w:r>
+        <w:rPr>
+          <w:rFonts w:ascii="Courier New" w:hAnsi="Courier New"/>
+          <w:sz w:val="19"/>
+        </w:rPr>
+        <w:t xml:space="preserve">  "analog_ch4_mode": "0-10V",</w:t>
+      </w:r>
+    </w:p>
+    <w:p>
+      <w:pPr>
+        <w:spacing w:after="0"/>
+        <w:ind w:left="360"/>
+      </w:pPr>
+      <w:r>
+        <w:rPr>
+          <w:rFonts w:ascii="Courier New" w:hAnsi="Courier New"/>
+          <w:sz w:val="19"/>
+        </w:rPr>
+        <w:t xml:space="preserve">  "digital_in1": true,</w:t>
+      </w:r>
+    </w:p>
+    <w:p>
+      <w:pPr>
+        <w:spacing w:after="0"/>
+        <w:ind w:left="360"/>
+      </w:pPr>
+      <w:r>
+        <w:rPr>
+          <w:rFonts w:ascii="Courier New" w:hAnsi="Courier New"/>
+          <w:sz w:val="19"/>
+        </w:rPr>
+        <w:t xml:space="preserve">  "digital_in2": false,</w:t>
+      </w:r>
+    </w:p>
+    <w:p>
+      <w:pPr>
+        <w:spacing w:after="0"/>
+        <w:ind w:left="360"/>
+      </w:pPr>
+      <w:r>
+        <w:rPr>
+          <w:rFonts w:ascii="Courier New" w:hAnsi="Courier New"/>
+          <w:sz w:val="19"/>
+        </w:rPr>
+        <w:t xml:space="preserve">  "digital_in3": false,</w:t>
+      </w:r>
+    </w:p>
+    <w:p>
+      <w:pPr>
+        <w:spacing w:after="0"/>
+        <w:ind w:left="360"/>
+      </w:pPr>
+      <w:r>
+        <w:rPr>
+          <w:rFonts w:ascii="Courier New" w:hAnsi="Courier New"/>
+          <w:sz w:val="19"/>
+        </w:rPr>
+        <w:t xml:space="preserve">  "digital_in4": false,</w:t>
+      </w:r>
+    </w:p>
+    <w:p>
+      <w:pPr>
+        <w:spacing w:after="0"/>
+        <w:ind w:left="360"/>
+      </w:pPr>
+      <w:r>
+        <w:rPr>
+          <w:rFonts w:ascii="Courier New" w:hAnsi="Courier New"/>
+          <w:sz w:val="19"/>
+        </w:rPr>
+        <w:t xml:space="preserve">  "digital_out1": false,</w:t>
+      </w:r>
+    </w:p>
+    <w:p>
+      <w:pPr>
+        <w:spacing w:after="0"/>
+        <w:ind w:left="360"/>
+      </w:pPr>
+      <w:r>
+        <w:rPr>
+          <w:rFonts w:ascii="Courier New" w:hAnsi="Courier New"/>
+          <w:sz w:val="19"/>
+        </w:rPr>
+        <w:t xml:space="preserve">  "digital_out2": false,</w:t>
+      </w:r>
+    </w:p>
+    <w:p>
+      <w:pPr>
+        <w:spacing w:after="0"/>
+        <w:ind w:left="360"/>
+      </w:pPr>
+      <w:r>
+        <w:rPr>
+          <w:rFonts w:ascii="Courier New" w:hAnsi="Courier New"/>
+          <w:sz w:val="19"/>
+        </w:rPr>
+        <w:t xml:space="preserve">  "digital_out3": false,</w:t>
+      </w:r>
+    </w:p>
+    <w:p>
+      <w:pPr>
+        <w:spacing w:after="0"/>
+        <w:ind w:left="360"/>
+      </w:pPr>
+      <w:r>
+        <w:rPr>
+          <w:rFonts w:ascii="Courier New" w:hAnsi="Courier New"/>
+          <w:sz w:val="19"/>
+        </w:rPr>
+        <w:t xml:space="preserve">  "digital_out4": false,</w:t>
+      </w:r>
+    </w:p>
+    <w:p>
+      <w:pPr>
+        <w:spacing w:after="0"/>
+        <w:ind w:left="360"/>
+      </w:pPr>
+      <w:r>
+        <w:rPr>
+          <w:rFonts w:ascii="Courier New" w:hAnsi="Courier New"/>
+          <w:sz w:val="19"/>
+        </w:rPr>
+        <w:t xml:space="preserve">  "rtc_time": "2026-07-06T10:23:10Z"</w:t>
+      </w:r>
+    </w:p>
+    <w:p>
+      <w:pPr>
+        <w:spacing w:after="0"/>
+        <w:ind w:left="360"/>
+      </w:pPr>
+      <w:r>
+        <w:rPr>
+          <w:rFonts w:ascii="Courier New" w:hAnsi="Courier New"/>
+          <w:sz w:val="19"/>
+        </w:rPr>
+        <w:t>}</w:t>
+      </w:r>
+    </w:p>
+    <w:p>
+      <w:pPr>
+        <w:spacing w:before="120" w:after="40"/>
+      </w:pPr>
+      <w:r>
+        <w:rPr>
+          <w:b/>
+          <w:color w:val="3C3C3C"/>
+          <w:sz w:val="22"/>
+        </w:rPr>
+        <w:t>B. Event Logger Endpoint (`POST /api/device-events`)</w:t>
+      </w:r>
+    </w:p>
+    <w:p>
+      <w:pPr>
+        <w:spacing w:after="120"/>
+      </w:pPr>
+      <w:r>
+        <w:t>Allows the ESP32 to report startup boot parameters, I2C bus errors, or manual reset triggers to the admin console.</w:t>
+      </w:r>
+    </w:p>
+    <w:p>
+      <w:pPr>
+        <w:spacing w:after="0"/>
+        <w:ind w:left="360"/>
+      </w:pPr>
+      <w:r>
+        <w:rPr>
+          <w:rFonts w:ascii="Courier New" w:hAnsi="Courier New"/>
+          <w:sz w:val="19"/>
+        </w:rPr>
+        <w:t>{</w:t>
+      </w:r>
+    </w:p>
+    <w:p>
+      <w:pPr>
+        <w:spacing w:after="0"/>
+        <w:ind w:left="360"/>
+      </w:pPr>
+      <w:r>
+        <w:rPr>
+          <w:rFonts w:ascii="Courier New" w:hAnsi="Courier New"/>
+          <w:sz w:val="19"/>
+        </w:rPr>
+        <w:t xml:space="preserve">  "device_id": "62fc163f-e804-4676-a221-731232a67a47",</w:t>
+      </w:r>
+    </w:p>
+    <w:p>
+      <w:pPr>
+        <w:spacing w:after="0"/>
+        <w:ind w:left="360"/>
+      </w:pPr>
+      <w:r>
+        <w:rPr>
+          <w:rFonts w:ascii="Courier New" w:hAnsi="Courier New"/>
+          <w:sz w:val="19"/>
+        </w:rPr>
+        <w:t xml:space="preserve">  "event_type": "critical",</w:t>
+      </w:r>
+    </w:p>
+    <w:p>
+      <w:pPr>
+        <w:spacing w:after="0"/>
+        <w:ind w:left="360"/>
+      </w:pPr>
+      <w:r>
+        <w:rPr>
+          <w:rFonts w:ascii="Courier New" w:hAnsi="Courier New"/>
+          <w:sz w:val="19"/>
+        </w:rPr>
+        <w:t xml:space="preserve">  "message": "I2C Sensor Bus Initialization Failed (ADS1115 or PCF8563 unresponsive)"</w:t>
+      </w:r>
+    </w:p>
+    <w:p>
+      <w:pPr>
+        <w:spacing w:after="0"/>
+        <w:ind w:left="360"/>
+      </w:pPr>
+      <w:r>
+        <w:rPr>
+          <w:rFonts w:ascii="Courier New" w:hAnsi="Courier New"/>
+          <w:sz w:val="19"/>
+        </w:rPr>
+        <w:t>}</w:t>
+      </w:r>
+    </w:p>
+    <w:p>
+      <w:pPr>
+        <w:spacing w:before="120" w:after="40"/>
+      </w:pPr>
+      <w:r>
+        <w:rPr>
+          <w:b/>
+          <w:color w:val="3C3C3C"/>
+          <w:sz w:val="22"/>
+        </w:rPr>
+        <w:t>C. Modbus Readings Endpoint (`POST /api/modbus/readings`)</w:t>
+      </w:r>
+    </w:p>
+    <w:p>
+      <w:pPr>
+        <w:spacing w:after="120"/>
+      </w:pPr>
+      <w:r>
+        <w:t>Pushes register readings polled from Modbus slave devices over RS485 Serial.</w:t>
+      </w:r>
+    </w:p>
+    <w:p>
+      <w:pPr>
+        <w:spacing w:after="0"/>
+        <w:ind w:left="360"/>
+      </w:pPr>
+      <w:r>
+        <w:rPr>
+          <w:rFonts w:ascii="Courier New" w:hAnsi="Courier New"/>
+          <w:sz w:val="19"/>
+        </w:rPr>
+        <w:t>{</w:t>
+      </w:r>
+    </w:p>
+    <w:p>
+      <w:pPr>
+        <w:spacing w:after="0"/>
+        <w:ind w:left="360"/>
+      </w:pPr>
+      <w:r>
+        <w:rPr>
+          <w:rFonts w:ascii="Courier New" w:hAnsi="Courier New"/>
+          <w:sz w:val="19"/>
+        </w:rPr>
+        <w:t xml:space="preserve">  "modbus_device_id": "426e2cb0-76d6-4158-b0be-a092cab78c78",</w:t>
+      </w:r>
+    </w:p>
+    <w:p>
+      <w:pPr>
+        <w:spacing w:after="0"/>
+        <w:ind w:left="360"/>
+      </w:pPr>
+      <w:r>
+        <w:rPr>
+          <w:rFonts w:ascii="Courier New" w:hAnsi="Courier New"/>
+          <w:sz w:val="19"/>
+        </w:rPr>
+        <w:t xml:space="preserve">  "register_id": "8af76cde-129a-4eab-89cd-09a7b716ca32",</w:t>
+      </w:r>
+    </w:p>
+    <w:p>
+      <w:pPr>
+        <w:spacing w:after="0"/>
+        <w:ind w:left="360"/>
+      </w:pPr>
+      <w:r>
+        <w:rPr>
+          <w:rFonts w:ascii="Courier New" w:hAnsi="Courier New"/>
+          <w:sz w:val="19"/>
+        </w:rPr>
+        <w:t xml:space="preserve">  "raw_value": "01f3",</w:t>
+      </w:r>
+    </w:p>
+    <w:p>
+      <w:pPr>
+        <w:spacing w:after="0"/>
+        <w:ind w:left="360"/>
+      </w:pPr>
+      <w:r>
+        <w:rPr>
+          <w:rFonts w:ascii="Courier New" w:hAnsi="Courier New"/>
+          <w:sz w:val="19"/>
+        </w:rPr>
+        <w:t xml:space="preserve">  "scaled_value": 49.9</w:t>
+      </w:r>
+    </w:p>
+    <w:p>
+      <w:pPr>
+        <w:spacing w:after="0"/>
+        <w:ind w:left="360"/>
+      </w:pPr>
+      <w:r>
+        <w:rPr>
+          <w:rFonts w:ascii="Courier New" w:hAnsi="Courier New"/>
+          <w:sz w:val="19"/>
+        </w:rPr>
+        <w:t>}</w:t>
+      </w:r>
+    </w:p>
+    <w:p>
+      <w:pPr>
+        <w:spacing w:before="160" w:after="40"/>
+      </w:pPr>
+      <w:r>
+        <w:rPr>
+          <w:b/>
+          <w:color w:val="3C3C3C"/>
+          <w:sz w:val="26"/>
+        </w:rPr>
+        <w:t>4. Outage Outbox Buffer &amp; Synchronization</w:t>
+      </w:r>
+    </w:p>
+    <w:p>
+      <w:pPr>
+        <w:pStyle w:val="ListBullet"/>
+        <w:spacing w:after="40"/>
+      </w:pPr>
+      <w:r>
+        <w:t xml:space="preserve">  If the gateway receives an HTTP response other than `200` / `201` (or fails to connect), it enters the Offline state.</w:t>
+      </w:r>
+    </w:p>
+    <w:p>
+      <w:pPr>
+        <w:pStyle w:val="ListBullet"/>
+        <w:spacing w:after="40"/>
+      </w:pPr>
+      <w:r>
+        <w:t xml:space="preserve">  **Storage Loop**: Serializes the standard telemetry JSON schema and writes it as a plain-text string directly to a circular queue inside the **W25Q64 SPI Flash**.</w:t>
+      </w:r>
+    </w:p>
+    <w:p>
+      <w:pPr>
+        <w:pStyle w:val="ListBullet"/>
+        <w:spacing w:after="40"/>
+      </w:pPr>
+      <w:r>
+        <w:t xml:space="preserve">  **Pointer Registry**: Writes the new write pointer address `flashWritePtr` to the ESP32's non-volatile storage (NVS) using Arduino `Preferences`.</w:t>
+      </w:r>
+    </w:p>
+    <w:p>
+      <w:pPr>
+        <w:pStyle w:val="ListBullet"/>
+        <w:spacing w:after="40"/>
+      </w:pPr>
+      <w:r>
+        <w:t xml:space="preserve">  **Sync Recovery**: Once Wi-Fi reconnects, it initiates a FIFO (First-In, First-Out) reading scan from `flashReadPtr` to `flashWritePtr`. Pushes each logged record to `/device-readings` sequentially, incrementing and committing `flashReadPtr` in NVS only upon getting an `HTTP 201 Created` confirmation.</w:t>
+      </w:r>
+    </w:p>
+    <w:p>
+      <w:pPr>
+        <w:spacing w:before="240" w:after="80"/>
+      </w:pPr>
+      <w:r>
+        <w:rPr>
+          <w:b/>
+          <w:color w:val="3873AC"/>
+          <w:sz w:val="32"/>
+        </w:rPr>
         <w:t>🛡️ Fail-Safe Mechanisms &amp; Stability Policies</w:t>
       </w:r>
     </w:p>

</xml_diff>